<commit_message>
docs(acpos): close 10 exact-relation definition gaps
</commit_message>
<xml_diff>
--- a/ACPOS_AIAPI-01_AI_API管理_Mother_Basic_Design_OPTIMIZED.docx
+++ b/ACPOS_AIAPI-01_AI_API管理_Mother_Basic_Design_OPTIMIZED.docx
@@ -22617,10 +22617,7 @@
           </w:tcPr>
           <w:p>
             <w:r>
-              <w:rPr>
-                <w:sz w:val="10"/>
-              </w:rPr>
-              <w:t>—</w:t>
+              <w:t>quality.criteria.configure</w:t>
             </w:r>
           </w:p>
         </w:tc>
@@ -22788,10 +22785,7 @@
           </w:tcPr>
           <w:p>
             <w:r>
-              <w:rPr>
-                <w:sz w:val="10"/>
-              </w:rPr>
-              <w:t>—</w:t>
+              <w:t>governance.approve</w:t>
             </w:r>
           </w:p>
         </w:tc>

</xml_diff>

<commit_message>
docs(acpos): classify 30 explicit N/A action gaps
</commit_message>
<xml_diff>
--- a/ACPOS_AIAPI-01_AI_API管理_Mother_Basic_Design_OPTIMIZED.docx
+++ b/ACPOS_AIAPI-01_AI_API管理_Mother_Basic_Design_OPTIMIZED.docx
@@ -24263,9 +24263,1454 @@
         <w:t>The exact control denominator above is the only construction denominator for this page. Components/fields/visual IDs are not counted as additional controls. Existing source UIDs are preserved. A control classified UI_LOCAL_EXACT MUST NOT create a server write. A control classified SPEC_EXACT_RUNTIME_BLOCKED / NOT_EXECUTED MUST remain disabled or fail-closed until its runtime evidence exists.</w:t>
       </w:r>
     </w:p>
+    <w:p>
+      <w:pPr>
+        <w:sectPr>
+          <w:pgSz w:w="16838" w:h="11906" w:orient="landscape"/>
+          <w:pgMar w:top="576" w:right="504" w:bottom="576" w:left="504" w:header="283" w:footer="283" w:gutter="0"/>
+          <w:cols w:space="720"/>
+          <w:docGrid w:linePitch="360"/>
+        </w:sectPr>
+      </w:pPr>
+    </w:p>
+    <w:p>
+      <w:pPr>
+        <w:pStyle w:val="Heading1"/>
+      </w:pPr>
+      <w:r>
+        <w:t>Batch 13 · Action UID Applicability Ledger</w:t>
+      </w:r>
+    </w:p>
+    <w:p>
+      <w:r>
+        <w:rPr>
+          <w:b/>
+        </w:rPr>
+        <w:t xml:space="preserve">[ACPOS-20260921-BATCH-13-EXPLICIT-NA-ACTION-SEMANTICS-V1::PAGE::AIAPI-01] </w:t>
+      </w:r>
+      <w:r>
+        <w:t>This ledger records applicability only. Product Control Registry rows remain unchanged; Action UID stays '—'. These rows MUST NOT be parsed as additional product controls.</w:t>
+      </w:r>
+    </w:p>
+    <w:tbl>
+      <w:tblPr>
+        <w:tblStyle w:val="TableGrid"/>
+        <w:tblW w:type="auto" w:w="0"/>
+        <w:tblLook w:firstColumn="1" w:firstRow="1" w:lastColumn="0" w:lastRow="0" w:noHBand="0" w:noVBand="1" w:val="04A0"/>
+      </w:tblPr>
+      <w:tblGrid>
+        <w:gridCol w:w="2208"/>
+        <w:gridCol w:w="2208"/>
+        <w:gridCol w:w="2208"/>
+        <w:gridCol w:w="2208"/>
+        <w:gridCol w:w="2208"/>
+      </w:tblGrid>
+      <w:tr>
+        <w:trPr>
+          <w:tblHeader w:val="true"/>
+        </w:trPr>
+        <w:tc>
+          <w:tcPr>
+            <w:tcW w:type="dxa" w:w="2208"/>
+            <w:shd w:fill="EDE9FE"/>
+          </w:tcPr>
+          <w:p>
+            <w:pPr>
+              <w:spacing w:before="0" w:after="0"/>
+            </w:pPr>
+            <w:r>
+              <w:rPr>
+                <w:sz w:val="9"/>
+              </w:rPr>
+              <w:t>Target UID</w:t>
+            </w:r>
+          </w:p>
+        </w:tc>
+        <w:tc>
+          <w:tcPr>
+            <w:tcW w:type="dxa" w:w="2208"/>
+            <w:shd w:fill="EDE9FE"/>
+          </w:tcPr>
+          <w:p>
+            <w:pPr>
+              <w:spacing w:before="0" w:after="0"/>
+            </w:pPr>
+            <w:r>
+              <w:rPr>
+                <w:sz w:val="9"/>
+              </w:rPr>
+              <w:t>Field</w:t>
+            </w:r>
+          </w:p>
+        </w:tc>
+        <w:tc>
+          <w:tcPr>
+            <w:tcW w:type="dxa" w:w="2208"/>
+            <w:shd w:fill="EDE9FE"/>
+          </w:tcPr>
+          <w:p>
+            <w:pPr>
+              <w:spacing w:before="0" w:after="0"/>
+            </w:pPr>
+            <w:r>
+              <w:rPr>
+                <w:sz w:val="9"/>
+              </w:rPr>
+              <w:t>Current Cell</w:t>
+            </w:r>
+          </w:p>
+        </w:tc>
+        <w:tc>
+          <w:tcPr>
+            <w:tcW w:type="dxa" w:w="2208"/>
+            <w:shd w:fill="EDE9FE"/>
+          </w:tcPr>
+          <w:p>
+            <w:pPr>
+              <w:spacing w:before="0" w:after="0"/>
+            </w:pPr>
+            <w:r>
+              <w:rPr>
+                <w:sz w:val="9"/>
+              </w:rPr>
+              <w:t>Applicability Class</w:t>
+            </w:r>
+          </w:p>
+        </w:tc>
+        <w:tc>
+          <w:tcPr>
+            <w:tcW w:type="dxa" w:w="2208"/>
+            <w:shd w:fill="EDE9FE"/>
+          </w:tcPr>
+          <w:p>
+            <w:pPr>
+              <w:spacing w:before="0" w:after="0"/>
+            </w:pPr>
+            <w:r>
+              <w:rPr>
+                <w:sz w:val="9"/>
+              </w:rPr>
+              <w:t>Required Handling</w:t>
+            </w:r>
+          </w:p>
+        </w:tc>
+      </w:tr>
+      <w:tr>
+        <w:tc>
+          <w:tcPr>
+            <w:tcW w:type="dxa" w:w="2208"/>
+          </w:tcPr>
+          <w:p>
+            <w:pPr>
+              <w:spacing w:before="0" w:after="0"/>
+            </w:pPr>
+            <w:r>
+              <w:rPr>
+                <w:sz w:val="9"/>
+              </w:rPr>
+              <w:t>AIAPI-01-BTN-APPROVE-GOVERNED-RESOURCE</w:t>
+            </w:r>
+          </w:p>
+        </w:tc>
+        <w:tc>
+          <w:tcPr>
+            <w:tcW w:type="dxa" w:w="2208"/>
+          </w:tcPr>
+          <w:p>
+            <w:pPr>
+              <w:spacing w:before="0" w:after="0"/>
+            </w:pPr>
+            <w:r>
+              <w:rPr>
+                <w:sz w:val="9"/>
+              </w:rPr>
+              <w:t>Action UID</w:t>
+            </w:r>
+          </w:p>
+        </w:tc>
+        <w:tc>
+          <w:tcPr>
+            <w:tcW w:type="dxa" w:w="2208"/>
+          </w:tcPr>
+          <w:p>
+            <w:pPr>
+              <w:spacing w:before="0" w:after="0"/>
+            </w:pPr>
+            <w:r>
+              <w:rPr>
+                <w:sz w:val="9"/>
+              </w:rPr>
+              <w:t>—</w:t>
+            </w:r>
+          </w:p>
+        </w:tc>
+        <w:tc>
+          <w:tcPr>
+            <w:tcW w:type="dxa" w:w="2208"/>
+          </w:tcPr>
+          <w:p>
+            <w:pPr>
+              <w:spacing w:before="0" w:after="0"/>
+            </w:pPr>
+            <w:r>
+              <w:rPr>
+                <w:sz w:val="9"/>
+              </w:rPr>
+              <w:t>LEGITIMATE_NA_DIRECT_OPERATION_ACTION</w:t>
+            </w:r>
+          </w:p>
+        </w:tc>
+        <w:tc>
+          <w:tcPr>
+            <w:tcW w:type="dxa" w:w="2208"/>
+          </w:tcPr>
+          <w:p>
+            <w:pPr>
+              <w:spacing w:before="0" w:after="0"/>
+            </w:pPr>
+            <w:r>
+              <w:rPr>
+                <w:sz w:val="9"/>
+              </w:rPr>
+              <w:t>DO_NOT_INVENT_ACTION_UID</w:t>
+            </w:r>
+          </w:p>
+        </w:tc>
+      </w:tr>
+      <w:tr>
+        <w:tc>
+          <w:tcPr>
+            <w:tcW w:type="dxa" w:w="2208"/>
+          </w:tcPr>
+          <w:p>
+            <w:pPr>
+              <w:spacing w:before="0" w:after="0"/>
+            </w:pPr>
+            <w:r>
+              <w:rPr>
+                <w:sz w:val="9"/>
+              </w:rPr>
+              <w:t>AIAPI-01-BTN-CONFIGURE-GOVERNED-RESOURCE</w:t>
+            </w:r>
+          </w:p>
+        </w:tc>
+        <w:tc>
+          <w:tcPr>
+            <w:tcW w:type="dxa" w:w="2208"/>
+          </w:tcPr>
+          <w:p>
+            <w:pPr>
+              <w:spacing w:before="0" w:after="0"/>
+            </w:pPr>
+            <w:r>
+              <w:rPr>
+                <w:sz w:val="9"/>
+              </w:rPr>
+              <w:t>Action UID</w:t>
+            </w:r>
+          </w:p>
+        </w:tc>
+        <w:tc>
+          <w:tcPr>
+            <w:tcW w:type="dxa" w:w="2208"/>
+          </w:tcPr>
+          <w:p>
+            <w:pPr>
+              <w:spacing w:before="0" w:after="0"/>
+            </w:pPr>
+            <w:r>
+              <w:rPr>
+                <w:sz w:val="9"/>
+              </w:rPr>
+              <w:t>—</w:t>
+            </w:r>
+          </w:p>
+        </w:tc>
+        <w:tc>
+          <w:tcPr>
+            <w:tcW w:type="dxa" w:w="2208"/>
+          </w:tcPr>
+          <w:p>
+            <w:pPr>
+              <w:spacing w:before="0" w:after="0"/>
+            </w:pPr>
+            <w:r>
+              <w:rPr>
+                <w:sz w:val="9"/>
+              </w:rPr>
+              <w:t>LEGITIMATE_NA_DIRECT_OPERATION_ACTION</w:t>
+            </w:r>
+          </w:p>
+        </w:tc>
+        <w:tc>
+          <w:tcPr>
+            <w:tcW w:type="dxa" w:w="2208"/>
+          </w:tcPr>
+          <w:p>
+            <w:pPr>
+              <w:spacing w:before="0" w:after="0"/>
+            </w:pPr>
+            <w:r>
+              <w:rPr>
+                <w:sz w:val="9"/>
+              </w:rPr>
+              <w:t>DO_NOT_INVENT_ACTION_UID</w:t>
+            </w:r>
+          </w:p>
+        </w:tc>
+      </w:tr>
+      <w:tr>
+        <w:tc>
+          <w:tcPr>
+            <w:tcW w:type="dxa" w:w="2208"/>
+          </w:tcPr>
+          <w:p>
+            <w:pPr>
+              <w:spacing w:before="0" w:after="0"/>
+            </w:pPr>
+            <w:r>
+              <w:rPr>
+                <w:sz w:val="9"/>
+              </w:rPr>
+              <w:t>AIAPI-01-BTN-RUN-PROVIDER-QUEUE-PROBE</w:t>
+            </w:r>
+          </w:p>
+        </w:tc>
+        <w:tc>
+          <w:tcPr>
+            <w:tcW w:type="dxa" w:w="2208"/>
+          </w:tcPr>
+          <w:p>
+            <w:pPr>
+              <w:spacing w:before="0" w:after="0"/>
+            </w:pPr>
+            <w:r>
+              <w:rPr>
+                <w:sz w:val="9"/>
+              </w:rPr>
+              <w:t>Action UID</w:t>
+            </w:r>
+          </w:p>
+        </w:tc>
+        <w:tc>
+          <w:tcPr>
+            <w:tcW w:type="dxa" w:w="2208"/>
+          </w:tcPr>
+          <w:p>
+            <w:pPr>
+              <w:spacing w:before="0" w:after="0"/>
+            </w:pPr>
+            <w:r>
+              <w:rPr>
+                <w:sz w:val="9"/>
+              </w:rPr>
+              <w:t>—</w:t>
+            </w:r>
+          </w:p>
+        </w:tc>
+        <w:tc>
+          <w:tcPr>
+            <w:tcW w:type="dxa" w:w="2208"/>
+          </w:tcPr>
+          <w:p>
+            <w:pPr>
+              <w:spacing w:before="0" w:after="0"/>
+            </w:pPr>
+            <w:r>
+              <w:rPr>
+                <w:sz w:val="9"/>
+              </w:rPr>
+              <w:t>LEGITIMATE_NA_DIRECT_OPERATION_ACTION</w:t>
+            </w:r>
+          </w:p>
+        </w:tc>
+        <w:tc>
+          <w:tcPr>
+            <w:tcW w:type="dxa" w:w="2208"/>
+          </w:tcPr>
+          <w:p>
+            <w:pPr>
+              <w:spacing w:before="0" w:after="0"/>
+            </w:pPr>
+            <w:r>
+              <w:rPr>
+                <w:sz w:val="9"/>
+              </w:rPr>
+              <w:t>DO_NOT_INVENT_ACTION_UID</w:t>
+            </w:r>
+          </w:p>
+        </w:tc>
+      </w:tr>
+      <w:tr>
+        <w:tc>
+          <w:tcPr>
+            <w:tcW w:type="dxa" w:w="2208"/>
+          </w:tcPr>
+          <w:p>
+            <w:pPr>
+              <w:spacing w:before="0" w:after="0"/>
+            </w:pPr>
+            <w:r>
+              <w:rPr>
+                <w:sz w:val="9"/>
+              </w:rPr>
+              <w:t>CTRL-ADMIN-AIAPI-05-PROVIDER-CANDIDATE-GROUPS-CREATE-GROUP</w:t>
+            </w:r>
+          </w:p>
+        </w:tc>
+        <w:tc>
+          <w:tcPr>
+            <w:tcW w:type="dxa" w:w="2208"/>
+          </w:tcPr>
+          <w:p>
+            <w:pPr>
+              <w:spacing w:before="0" w:after="0"/>
+            </w:pPr>
+            <w:r>
+              <w:rPr>
+                <w:sz w:val="9"/>
+              </w:rPr>
+              <w:t>Action UID</w:t>
+            </w:r>
+          </w:p>
+        </w:tc>
+        <w:tc>
+          <w:tcPr>
+            <w:tcW w:type="dxa" w:w="2208"/>
+          </w:tcPr>
+          <w:p>
+            <w:pPr>
+              <w:spacing w:before="0" w:after="0"/>
+            </w:pPr>
+            <w:r>
+              <w:rPr>
+                <w:sz w:val="9"/>
+              </w:rPr>
+              <w:t>—</w:t>
+            </w:r>
+          </w:p>
+        </w:tc>
+        <w:tc>
+          <w:tcPr>
+            <w:tcW w:type="dxa" w:w="2208"/>
+          </w:tcPr>
+          <w:p>
+            <w:pPr>
+              <w:spacing w:before="0" w:after="0"/>
+            </w:pPr>
+            <w:r>
+              <w:rPr>
+                <w:sz w:val="9"/>
+              </w:rPr>
+              <w:t>LEGITIMATE_NA_DIRECT_OPERATION_ACTION</w:t>
+            </w:r>
+          </w:p>
+        </w:tc>
+        <w:tc>
+          <w:tcPr>
+            <w:tcW w:type="dxa" w:w="2208"/>
+          </w:tcPr>
+          <w:p>
+            <w:pPr>
+              <w:spacing w:before="0" w:after="0"/>
+            </w:pPr>
+            <w:r>
+              <w:rPr>
+                <w:sz w:val="9"/>
+              </w:rPr>
+              <w:t>DO_NOT_INVENT_ACTION_UID</w:t>
+            </w:r>
+          </w:p>
+        </w:tc>
+      </w:tr>
+      <w:tr>
+        <w:tc>
+          <w:tcPr>
+            <w:tcW w:type="dxa" w:w="2208"/>
+          </w:tcPr>
+          <w:p>
+            <w:pPr>
+              <w:spacing w:before="0" w:after="0"/>
+            </w:pPr>
+            <w:r>
+              <w:rPr>
+                <w:sz w:val="9"/>
+              </w:rPr>
+              <w:t>CTRL-ADMIN-AIAPI-05-PROVIDER-CANDIDATE-GROUPS-RESTORE-PROVIDER</w:t>
+            </w:r>
+          </w:p>
+        </w:tc>
+        <w:tc>
+          <w:tcPr>
+            <w:tcW w:type="dxa" w:w="2208"/>
+          </w:tcPr>
+          <w:p>
+            <w:pPr>
+              <w:spacing w:before="0" w:after="0"/>
+            </w:pPr>
+            <w:r>
+              <w:rPr>
+                <w:sz w:val="9"/>
+              </w:rPr>
+              <w:t>Action UID</w:t>
+            </w:r>
+          </w:p>
+        </w:tc>
+        <w:tc>
+          <w:tcPr>
+            <w:tcW w:type="dxa" w:w="2208"/>
+          </w:tcPr>
+          <w:p>
+            <w:pPr>
+              <w:spacing w:before="0" w:after="0"/>
+            </w:pPr>
+            <w:r>
+              <w:rPr>
+                <w:sz w:val="9"/>
+              </w:rPr>
+              <w:t>—</w:t>
+            </w:r>
+          </w:p>
+        </w:tc>
+        <w:tc>
+          <w:tcPr>
+            <w:tcW w:type="dxa" w:w="2208"/>
+          </w:tcPr>
+          <w:p>
+            <w:pPr>
+              <w:spacing w:before="0" w:after="0"/>
+            </w:pPr>
+            <w:r>
+              <w:rPr>
+                <w:sz w:val="9"/>
+              </w:rPr>
+              <w:t>LEGITIMATE_NA_DIRECT_OPERATION_ACTION</w:t>
+            </w:r>
+          </w:p>
+        </w:tc>
+        <w:tc>
+          <w:tcPr>
+            <w:tcW w:type="dxa" w:w="2208"/>
+          </w:tcPr>
+          <w:p>
+            <w:pPr>
+              <w:spacing w:before="0" w:after="0"/>
+            </w:pPr>
+            <w:r>
+              <w:rPr>
+                <w:sz w:val="9"/>
+              </w:rPr>
+              <w:t>DO_NOT_INVENT_ACTION_UID</w:t>
+            </w:r>
+          </w:p>
+        </w:tc>
+      </w:tr>
+      <w:tr>
+        <w:tc>
+          <w:tcPr>
+            <w:tcW w:type="dxa" w:w="2208"/>
+          </w:tcPr>
+          <w:p>
+            <w:pPr>
+              <w:spacing w:before="0" w:after="0"/>
+            </w:pPr>
+            <w:r>
+              <w:rPr>
+                <w:sz w:val="9"/>
+              </w:rPr>
+              <w:t>CTRL-ADMIN-AIAPI-05-PROVIDER-CANDIDATE-GROUPS-VIEW-QUARANTINE</w:t>
+            </w:r>
+          </w:p>
+        </w:tc>
+        <w:tc>
+          <w:tcPr>
+            <w:tcW w:type="dxa" w:w="2208"/>
+          </w:tcPr>
+          <w:p>
+            <w:pPr>
+              <w:spacing w:before="0" w:after="0"/>
+            </w:pPr>
+            <w:r>
+              <w:rPr>
+                <w:sz w:val="9"/>
+              </w:rPr>
+              <w:t>Action UID</w:t>
+            </w:r>
+          </w:p>
+        </w:tc>
+        <w:tc>
+          <w:tcPr>
+            <w:tcW w:type="dxa" w:w="2208"/>
+          </w:tcPr>
+          <w:p>
+            <w:pPr>
+              <w:spacing w:before="0" w:after="0"/>
+            </w:pPr>
+            <w:r>
+              <w:rPr>
+                <w:sz w:val="9"/>
+              </w:rPr>
+              <w:t>—</w:t>
+            </w:r>
+          </w:p>
+        </w:tc>
+        <w:tc>
+          <w:tcPr>
+            <w:tcW w:type="dxa" w:w="2208"/>
+          </w:tcPr>
+          <w:p>
+            <w:pPr>
+              <w:spacing w:before="0" w:after="0"/>
+            </w:pPr>
+            <w:r>
+              <w:rPr>
+                <w:sz w:val="9"/>
+              </w:rPr>
+              <w:t>LEGITIMATE_NA_DIRECT_OPERATION_ACTION</w:t>
+            </w:r>
+          </w:p>
+        </w:tc>
+        <w:tc>
+          <w:tcPr>
+            <w:tcW w:type="dxa" w:w="2208"/>
+          </w:tcPr>
+          <w:p>
+            <w:pPr>
+              <w:spacing w:before="0" w:after="0"/>
+            </w:pPr>
+            <w:r>
+              <w:rPr>
+                <w:sz w:val="9"/>
+              </w:rPr>
+              <w:t>DO_NOT_INVENT_ACTION_UID</w:t>
+            </w:r>
+          </w:p>
+        </w:tc>
+      </w:tr>
+      <w:tr>
+        <w:tc>
+          <w:tcPr>
+            <w:tcW w:type="dxa" w:w="2208"/>
+          </w:tcPr>
+          <w:p>
+            <w:pPr>
+              <w:spacing w:before="0" w:after="0"/>
+            </w:pPr>
+            <w:r>
+              <w:rPr>
+                <w:sz w:val="9"/>
+              </w:rPr>
+              <w:t>CTRL-ADMIN-AIAPI-06-PROVIDER-MODEL-PROFILES-CREATE-PROFILE</w:t>
+            </w:r>
+          </w:p>
+        </w:tc>
+        <w:tc>
+          <w:tcPr>
+            <w:tcW w:type="dxa" w:w="2208"/>
+          </w:tcPr>
+          <w:p>
+            <w:pPr>
+              <w:spacing w:before="0" w:after="0"/>
+            </w:pPr>
+            <w:r>
+              <w:rPr>
+                <w:sz w:val="9"/>
+              </w:rPr>
+              <w:t>Action UID</w:t>
+            </w:r>
+          </w:p>
+        </w:tc>
+        <w:tc>
+          <w:tcPr>
+            <w:tcW w:type="dxa" w:w="2208"/>
+          </w:tcPr>
+          <w:p>
+            <w:pPr>
+              <w:spacing w:before="0" w:after="0"/>
+            </w:pPr>
+            <w:r>
+              <w:rPr>
+                <w:sz w:val="9"/>
+              </w:rPr>
+              <w:t>—</w:t>
+            </w:r>
+          </w:p>
+        </w:tc>
+        <w:tc>
+          <w:tcPr>
+            <w:tcW w:type="dxa" w:w="2208"/>
+          </w:tcPr>
+          <w:p>
+            <w:pPr>
+              <w:spacing w:before="0" w:after="0"/>
+            </w:pPr>
+            <w:r>
+              <w:rPr>
+                <w:sz w:val="9"/>
+              </w:rPr>
+              <w:t>LEGITIMATE_NA_DIRECT_OPERATION_ACTION</w:t>
+            </w:r>
+          </w:p>
+        </w:tc>
+        <w:tc>
+          <w:tcPr>
+            <w:tcW w:type="dxa" w:w="2208"/>
+          </w:tcPr>
+          <w:p>
+            <w:pPr>
+              <w:spacing w:before="0" w:after="0"/>
+            </w:pPr>
+            <w:r>
+              <w:rPr>
+                <w:sz w:val="9"/>
+              </w:rPr>
+              <w:t>DO_NOT_INVENT_ACTION_UID</w:t>
+            </w:r>
+          </w:p>
+        </w:tc>
+      </w:tr>
+      <w:tr>
+        <w:tc>
+          <w:tcPr>
+            <w:tcW w:type="dxa" w:w="2208"/>
+          </w:tcPr>
+          <w:p>
+            <w:pPr>
+              <w:spacing w:before="0" w:after="0"/>
+            </w:pPr>
+            <w:r>
+              <w:rPr>
+                <w:sz w:val="9"/>
+              </w:rPr>
+              <w:t>CTRL-ADMIN-AIAPI-06-PROVIDER-MODEL-PROFILES-DELETE-CREDENTIAL</w:t>
+            </w:r>
+          </w:p>
+        </w:tc>
+        <w:tc>
+          <w:tcPr>
+            <w:tcW w:type="dxa" w:w="2208"/>
+          </w:tcPr>
+          <w:p>
+            <w:pPr>
+              <w:spacing w:before="0" w:after="0"/>
+            </w:pPr>
+            <w:r>
+              <w:rPr>
+                <w:sz w:val="9"/>
+              </w:rPr>
+              <w:t>Action UID</w:t>
+            </w:r>
+          </w:p>
+        </w:tc>
+        <w:tc>
+          <w:tcPr>
+            <w:tcW w:type="dxa" w:w="2208"/>
+          </w:tcPr>
+          <w:p>
+            <w:pPr>
+              <w:spacing w:before="0" w:after="0"/>
+            </w:pPr>
+            <w:r>
+              <w:rPr>
+                <w:sz w:val="9"/>
+              </w:rPr>
+              <w:t>—</w:t>
+            </w:r>
+          </w:p>
+        </w:tc>
+        <w:tc>
+          <w:tcPr>
+            <w:tcW w:type="dxa" w:w="2208"/>
+          </w:tcPr>
+          <w:p>
+            <w:pPr>
+              <w:spacing w:before="0" w:after="0"/>
+            </w:pPr>
+            <w:r>
+              <w:rPr>
+                <w:sz w:val="9"/>
+              </w:rPr>
+              <w:t>LEGITIMATE_NA_DIRECT_OPERATION_ACTION</w:t>
+            </w:r>
+          </w:p>
+        </w:tc>
+        <w:tc>
+          <w:tcPr>
+            <w:tcW w:type="dxa" w:w="2208"/>
+          </w:tcPr>
+          <w:p>
+            <w:pPr>
+              <w:spacing w:before="0" w:after="0"/>
+            </w:pPr>
+            <w:r>
+              <w:rPr>
+                <w:sz w:val="9"/>
+              </w:rPr>
+              <w:t>DO_NOT_INVENT_ACTION_UID</w:t>
+            </w:r>
+          </w:p>
+        </w:tc>
+      </w:tr>
+      <w:tr>
+        <w:tc>
+          <w:tcPr>
+            <w:tcW w:type="dxa" w:w="2208"/>
+          </w:tcPr>
+          <w:p>
+            <w:pPr>
+              <w:spacing w:before="0" w:after="0"/>
+            </w:pPr>
+            <w:r>
+              <w:rPr>
+                <w:sz w:val="9"/>
+              </w:rPr>
+              <w:t>CTRL-ADMIN-AIAPI-06-PROVIDER-MODEL-PROFILES-RETIRE-PROFILE</w:t>
+            </w:r>
+          </w:p>
+        </w:tc>
+        <w:tc>
+          <w:tcPr>
+            <w:tcW w:type="dxa" w:w="2208"/>
+          </w:tcPr>
+          <w:p>
+            <w:pPr>
+              <w:spacing w:before="0" w:after="0"/>
+            </w:pPr>
+            <w:r>
+              <w:rPr>
+                <w:sz w:val="9"/>
+              </w:rPr>
+              <w:t>Action UID</w:t>
+            </w:r>
+          </w:p>
+        </w:tc>
+        <w:tc>
+          <w:tcPr>
+            <w:tcW w:type="dxa" w:w="2208"/>
+          </w:tcPr>
+          <w:p>
+            <w:pPr>
+              <w:spacing w:before="0" w:after="0"/>
+            </w:pPr>
+            <w:r>
+              <w:rPr>
+                <w:sz w:val="9"/>
+              </w:rPr>
+              <w:t>—</w:t>
+            </w:r>
+          </w:p>
+        </w:tc>
+        <w:tc>
+          <w:tcPr>
+            <w:tcW w:type="dxa" w:w="2208"/>
+          </w:tcPr>
+          <w:p>
+            <w:pPr>
+              <w:spacing w:before="0" w:after="0"/>
+            </w:pPr>
+            <w:r>
+              <w:rPr>
+                <w:sz w:val="9"/>
+              </w:rPr>
+              <w:t>LEGITIMATE_NA_DIRECT_OPERATION_ACTION</w:t>
+            </w:r>
+          </w:p>
+        </w:tc>
+        <w:tc>
+          <w:tcPr>
+            <w:tcW w:type="dxa" w:w="2208"/>
+          </w:tcPr>
+          <w:p>
+            <w:pPr>
+              <w:spacing w:before="0" w:after="0"/>
+            </w:pPr>
+            <w:r>
+              <w:rPr>
+                <w:sz w:val="9"/>
+              </w:rPr>
+              <w:t>DO_NOT_INVENT_ACTION_UID</w:t>
+            </w:r>
+          </w:p>
+        </w:tc>
+      </w:tr>
+      <w:tr>
+        <w:tc>
+          <w:tcPr>
+            <w:tcW w:type="dxa" w:w="2208"/>
+          </w:tcPr>
+          <w:p>
+            <w:pPr>
+              <w:spacing w:before="0" w:after="0"/>
+            </w:pPr>
+            <w:r>
+              <w:rPr>
+                <w:sz w:val="9"/>
+              </w:rPr>
+              <w:t>CTRL-ADMIN-AIAPI-06-PROVIDER-MODEL-PROFILES-SET-CREDENTIAL</w:t>
+            </w:r>
+          </w:p>
+        </w:tc>
+        <w:tc>
+          <w:tcPr>
+            <w:tcW w:type="dxa" w:w="2208"/>
+          </w:tcPr>
+          <w:p>
+            <w:pPr>
+              <w:spacing w:before="0" w:after="0"/>
+            </w:pPr>
+            <w:r>
+              <w:rPr>
+                <w:sz w:val="9"/>
+              </w:rPr>
+              <w:t>Action UID</w:t>
+            </w:r>
+          </w:p>
+        </w:tc>
+        <w:tc>
+          <w:tcPr>
+            <w:tcW w:type="dxa" w:w="2208"/>
+          </w:tcPr>
+          <w:p>
+            <w:pPr>
+              <w:spacing w:before="0" w:after="0"/>
+            </w:pPr>
+            <w:r>
+              <w:rPr>
+                <w:sz w:val="9"/>
+              </w:rPr>
+              <w:t>—</w:t>
+            </w:r>
+          </w:p>
+        </w:tc>
+        <w:tc>
+          <w:tcPr>
+            <w:tcW w:type="dxa" w:w="2208"/>
+          </w:tcPr>
+          <w:p>
+            <w:pPr>
+              <w:spacing w:before="0" w:after="0"/>
+            </w:pPr>
+            <w:r>
+              <w:rPr>
+                <w:sz w:val="9"/>
+              </w:rPr>
+              <w:t>LEGITIMATE_NA_DIRECT_OPERATION_ACTION</w:t>
+            </w:r>
+          </w:p>
+        </w:tc>
+        <w:tc>
+          <w:tcPr>
+            <w:tcW w:type="dxa" w:w="2208"/>
+          </w:tcPr>
+          <w:p>
+            <w:pPr>
+              <w:spacing w:before="0" w:after="0"/>
+            </w:pPr>
+            <w:r>
+              <w:rPr>
+                <w:sz w:val="9"/>
+              </w:rPr>
+              <w:t>DO_NOT_INVENT_ACTION_UID</w:t>
+            </w:r>
+          </w:p>
+        </w:tc>
+      </w:tr>
+      <w:tr>
+        <w:tc>
+          <w:tcPr>
+            <w:tcW w:type="dxa" w:w="2208"/>
+          </w:tcPr>
+          <w:p>
+            <w:pPr>
+              <w:spacing w:before="0" w:after="0"/>
+            </w:pPr>
+            <w:r>
+              <w:rPr>
+                <w:sz w:val="9"/>
+              </w:rPr>
+              <w:t>CTRL-ADMIN-AIAPI-06-PROVIDER-MODEL-PROFILES-TEST-PROFILE</w:t>
+            </w:r>
+          </w:p>
+        </w:tc>
+        <w:tc>
+          <w:tcPr>
+            <w:tcW w:type="dxa" w:w="2208"/>
+          </w:tcPr>
+          <w:p>
+            <w:pPr>
+              <w:spacing w:before="0" w:after="0"/>
+            </w:pPr>
+            <w:r>
+              <w:rPr>
+                <w:sz w:val="9"/>
+              </w:rPr>
+              <w:t>Action UID</w:t>
+            </w:r>
+          </w:p>
+        </w:tc>
+        <w:tc>
+          <w:tcPr>
+            <w:tcW w:type="dxa" w:w="2208"/>
+          </w:tcPr>
+          <w:p>
+            <w:pPr>
+              <w:spacing w:before="0" w:after="0"/>
+            </w:pPr>
+            <w:r>
+              <w:rPr>
+                <w:sz w:val="9"/>
+              </w:rPr>
+              <w:t>—</w:t>
+            </w:r>
+          </w:p>
+        </w:tc>
+        <w:tc>
+          <w:tcPr>
+            <w:tcW w:type="dxa" w:w="2208"/>
+          </w:tcPr>
+          <w:p>
+            <w:pPr>
+              <w:spacing w:before="0" w:after="0"/>
+            </w:pPr>
+            <w:r>
+              <w:rPr>
+                <w:sz w:val="9"/>
+              </w:rPr>
+              <w:t>LEGITIMATE_NA_DIRECT_OPERATION_ACTION</w:t>
+            </w:r>
+          </w:p>
+        </w:tc>
+        <w:tc>
+          <w:tcPr>
+            <w:tcW w:type="dxa" w:w="2208"/>
+          </w:tcPr>
+          <w:p>
+            <w:pPr>
+              <w:spacing w:before="0" w:after="0"/>
+            </w:pPr>
+            <w:r>
+              <w:rPr>
+                <w:sz w:val="9"/>
+              </w:rPr>
+              <w:t>DO_NOT_INVENT_ACTION_UID</w:t>
+            </w:r>
+          </w:p>
+        </w:tc>
+      </w:tr>
+      <w:tr>
+        <w:tc>
+          <w:tcPr>
+            <w:tcW w:type="dxa" w:w="2208"/>
+          </w:tcPr>
+          <w:p>
+            <w:pPr>
+              <w:spacing w:before="0" w:after="0"/>
+            </w:pPr>
+            <w:r>
+              <w:rPr>
+                <w:sz w:val="9"/>
+              </w:rPr>
+              <w:t>CTRL-ADMIN-AIAPI-06-PROVIDER-MODEL-PROFILES-UPDATE-PROFILE</w:t>
+            </w:r>
+          </w:p>
+        </w:tc>
+        <w:tc>
+          <w:tcPr>
+            <w:tcW w:type="dxa" w:w="2208"/>
+          </w:tcPr>
+          <w:p>
+            <w:pPr>
+              <w:spacing w:before="0" w:after="0"/>
+            </w:pPr>
+            <w:r>
+              <w:rPr>
+                <w:sz w:val="9"/>
+              </w:rPr>
+              <w:t>Action UID</w:t>
+            </w:r>
+          </w:p>
+        </w:tc>
+        <w:tc>
+          <w:tcPr>
+            <w:tcW w:type="dxa" w:w="2208"/>
+          </w:tcPr>
+          <w:p>
+            <w:pPr>
+              <w:spacing w:before="0" w:after="0"/>
+            </w:pPr>
+            <w:r>
+              <w:rPr>
+                <w:sz w:val="9"/>
+              </w:rPr>
+              <w:t>—</w:t>
+            </w:r>
+          </w:p>
+        </w:tc>
+        <w:tc>
+          <w:tcPr>
+            <w:tcW w:type="dxa" w:w="2208"/>
+          </w:tcPr>
+          <w:p>
+            <w:pPr>
+              <w:spacing w:before="0" w:after="0"/>
+            </w:pPr>
+            <w:r>
+              <w:rPr>
+                <w:sz w:val="9"/>
+              </w:rPr>
+              <w:t>LEGITIMATE_NA_DIRECT_OPERATION_ACTION</w:t>
+            </w:r>
+          </w:p>
+        </w:tc>
+        <w:tc>
+          <w:tcPr>
+            <w:tcW w:type="dxa" w:w="2208"/>
+          </w:tcPr>
+          <w:p>
+            <w:pPr>
+              <w:spacing w:before="0" w:after="0"/>
+            </w:pPr>
+            <w:r>
+              <w:rPr>
+                <w:sz w:val="9"/>
+              </w:rPr>
+              <w:t>DO_NOT_INVENT_ACTION_UID</w:t>
+            </w:r>
+          </w:p>
+        </w:tc>
+      </w:tr>
+      <w:tr>
+        <w:tc>
+          <w:tcPr>
+            <w:tcW w:type="dxa" w:w="2208"/>
+          </w:tcPr>
+          <w:p>
+            <w:pPr>
+              <w:spacing w:before="0" w:after="0"/>
+            </w:pPr>
+            <w:r>
+              <w:rPr>
+                <w:sz w:val="9"/>
+              </w:rPr>
+              <w:t>CTRL-ADMIN-AIAPI-06-PROVIDER-MODEL-PROFILES-VIEW-PROFILE</w:t>
+            </w:r>
+          </w:p>
+        </w:tc>
+        <w:tc>
+          <w:tcPr>
+            <w:tcW w:type="dxa" w:w="2208"/>
+          </w:tcPr>
+          <w:p>
+            <w:pPr>
+              <w:spacing w:before="0" w:after="0"/>
+            </w:pPr>
+            <w:r>
+              <w:rPr>
+                <w:sz w:val="9"/>
+              </w:rPr>
+              <w:t>Action UID</w:t>
+            </w:r>
+          </w:p>
+        </w:tc>
+        <w:tc>
+          <w:tcPr>
+            <w:tcW w:type="dxa" w:w="2208"/>
+          </w:tcPr>
+          <w:p>
+            <w:pPr>
+              <w:spacing w:before="0" w:after="0"/>
+            </w:pPr>
+            <w:r>
+              <w:rPr>
+                <w:sz w:val="9"/>
+              </w:rPr>
+              <w:t>—</w:t>
+            </w:r>
+          </w:p>
+        </w:tc>
+        <w:tc>
+          <w:tcPr>
+            <w:tcW w:type="dxa" w:w="2208"/>
+          </w:tcPr>
+          <w:p>
+            <w:pPr>
+              <w:spacing w:before="0" w:after="0"/>
+            </w:pPr>
+            <w:r>
+              <w:rPr>
+                <w:sz w:val="9"/>
+              </w:rPr>
+              <w:t>LEGITIMATE_NA_DIRECT_OPERATION_ACTION</w:t>
+            </w:r>
+          </w:p>
+        </w:tc>
+        <w:tc>
+          <w:tcPr>
+            <w:tcW w:type="dxa" w:w="2208"/>
+          </w:tcPr>
+          <w:p>
+            <w:pPr>
+              <w:spacing w:before="0" w:after="0"/>
+            </w:pPr>
+            <w:r>
+              <w:rPr>
+                <w:sz w:val="9"/>
+              </w:rPr>
+              <w:t>DO_NOT_INVENT_ACTION_UID</w:t>
+            </w:r>
+          </w:p>
+        </w:tc>
+      </w:tr>
+      <w:tr>
+        <w:tc>
+          <w:tcPr>
+            <w:tcW w:type="dxa" w:w="2208"/>
+          </w:tcPr>
+          <w:p>
+            <w:pPr>
+              <w:spacing w:before="0" w:after="0"/>
+            </w:pPr>
+            <w:r>
+              <w:rPr>
+                <w:sz w:val="9"/>
+              </w:rPr>
+              <w:t>CTRL-ADMIN-AIAPI-08-ROUTE-SIMULATION-EXECUTE-ROUTE</w:t>
+            </w:r>
+          </w:p>
+        </w:tc>
+        <w:tc>
+          <w:tcPr>
+            <w:tcW w:type="dxa" w:w="2208"/>
+          </w:tcPr>
+          <w:p>
+            <w:pPr>
+              <w:spacing w:before="0" w:after="0"/>
+            </w:pPr>
+            <w:r>
+              <w:rPr>
+                <w:sz w:val="9"/>
+              </w:rPr>
+              <w:t>Action UID</w:t>
+            </w:r>
+          </w:p>
+        </w:tc>
+        <w:tc>
+          <w:tcPr>
+            <w:tcW w:type="dxa" w:w="2208"/>
+          </w:tcPr>
+          <w:p>
+            <w:pPr>
+              <w:spacing w:before="0" w:after="0"/>
+            </w:pPr>
+            <w:r>
+              <w:rPr>
+                <w:sz w:val="9"/>
+              </w:rPr>
+              <w:t>—</w:t>
+            </w:r>
+          </w:p>
+        </w:tc>
+        <w:tc>
+          <w:tcPr>
+            <w:tcW w:type="dxa" w:w="2208"/>
+          </w:tcPr>
+          <w:p>
+            <w:pPr>
+              <w:spacing w:before="0" w:after="0"/>
+            </w:pPr>
+            <w:r>
+              <w:rPr>
+                <w:sz w:val="9"/>
+              </w:rPr>
+              <w:t>LEGITIMATE_NA_DIRECT_OPERATION_ACTION</w:t>
+            </w:r>
+          </w:p>
+        </w:tc>
+        <w:tc>
+          <w:tcPr>
+            <w:tcW w:type="dxa" w:w="2208"/>
+          </w:tcPr>
+          <w:p>
+            <w:pPr>
+              <w:spacing w:before="0" w:after="0"/>
+            </w:pPr>
+            <w:r>
+              <w:rPr>
+                <w:sz w:val="9"/>
+              </w:rPr>
+              <w:t>DO_NOT_INVENT_ACTION_UID</w:t>
+            </w:r>
+          </w:p>
+        </w:tc>
+      </w:tr>
+      <w:tr>
+        <w:tc>
+          <w:tcPr>
+            <w:tcW w:type="dxa" w:w="2208"/>
+          </w:tcPr>
+          <w:p>
+            <w:pPr>
+              <w:spacing w:before="0" w:after="0"/>
+            </w:pPr>
+            <w:r>
+              <w:rPr>
+                <w:sz w:val="9"/>
+              </w:rPr>
+              <w:t>CTRL-ADMIN-AIAPI-08-ROUTE-SIMULATION-VIEW-ROUTE-DECISION</w:t>
+            </w:r>
+          </w:p>
+        </w:tc>
+        <w:tc>
+          <w:tcPr>
+            <w:tcW w:type="dxa" w:w="2208"/>
+          </w:tcPr>
+          <w:p>
+            <w:pPr>
+              <w:spacing w:before="0" w:after="0"/>
+            </w:pPr>
+            <w:r>
+              <w:rPr>
+                <w:sz w:val="9"/>
+              </w:rPr>
+              <w:t>Action UID</w:t>
+            </w:r>
+          </w:p>
+        </w:tc>
+        <w:tc>
+          <w:tcPr>
+            <w:tcW w:type="dxa" w:w="2208"/>
+          </w:tcPr>
+          <w:p>
+            <w:pPr>
+              <w:spacing w:before="0" w:after="0"/>
+            </w:pPr>
+            <w:r>
+              <w:rPr>
+                <w:sz w:val="9"/>
+              </w:rPr>
+              <w:t>—</w:t>
+            </w:r>
+          </w:p>
+        </w:tc>
+        <w:tc>
+          <w:tcPr>
+            <w:tcW w:type="dxa" w:w="2208"/>
+          </w:tcPr>
+          <w:p>
+            <w:pPr>
+              <w:spacing w:before="0" w:after="0"/>
+            </w:pPr>
+            <w:r>
+              <w:rPr>
+                <w:sz w:val="9"/>
+              </w:rPr>
+              <w:t>LEGITIMATE_NA_DIRECT_OPERATION_ACTION</w:t>
+            </w:r>
+          </w:p>
+        </w:tc>
+        <w:tc>
+          <w:tcPr>
+            <w:tcW w:type="dxa" w:w="2208"/>
+          </w:tcPr>
+          <w:p>
+            <w:pPr>
+              <w:spacing w:before="0" w:after="0"/>
+            </w:pPr>
+            <w:r>
+              <w:rPr>
+                <w:sz w:val="9"/>
+              </w:rPr>
+              <w:t>DO_NOT_INVENT_ACTION_UID</w:t>
+            </w:r>
+          </w:p>
+        </w:tc>
+      </w:tr>
+      <w:tr>
+        <w:tc>
+          <w:tcPr>
+            <w:tcW w:type="dxa" w:w="2208"/>
+          </w:tcPr>
+          <w:p>
+            <w:pPr>
+              <w:spacing w:before="0" w:after="0"/>
+            </w:pPr>
+            <w:r>
+              <w:rPr>
+                <w:sz w:val="9"/>
+              </w:rPr>
+              <w:t>CTRL-ADMIN-AIAPI-09-ACT-02-ACT-KILL-SWITCH</w:t>
+            </w:r>
+          </w:p>
+        </w:tc>
+        <w:tc>
+          <w:tcPr>
+            <w:tcW w:type="dxa" w:w="2208"/>
+          </w:tcPr>
+          <w:p>
+            <w:pPr>
+              <w:spacing w:before="0" w:after="0"/>
+            </w:pPr>
+            <w:r>
+              <w:rPr>
+                <w:sz w:val="9"/>
+              </w:rPr>
+              <w:t>Action UID</w:t>
+            </w:r>
+          </w:p>
+        </w:tc>
+        <w:tc>
+          <w:tcPr>
+            <w:tcW w:type="dxa" w:w="2208"/>
+          </w:tcPr>
+          <w:p>
+            <w:pPr>
+              <w:spacing w:before="0" w:after="0"/>
+            </w:pPr>
+            <w:r>
+              <w:rPr>
+                <w:sz w:val="9"/>
+              </w:rPr>
+              <w:t>—</w:t>
+            </w:r>
+          </w:p>
+        </w:tc>
+        <w:tc>
+          <w:tcPr>
+            <w:tcW w:type="dxa" w:w="2208"/>
+          </w:tcPr>
+          <w:p>
+            <w:pPr>
+              <w:spacing w:before="0" w:after="0"/>
+            </w:pPr>
+            <w:r>
+              <w:rPr>
+                <w:sz w:val="9"/>
+              </w:rPr>
+              <w:t>LEGITIMATE_NA_DIRECT_OPERATION_ACTION</w:t>
+            </w:r>
+          </w:p>
+        </w:tc>
+        <w:tc>
+          <w:tcPr>
+            <w:tcW w:type="dxa" w:w="2208"/>
+          </w:tcPr>
+          <w:p>
+            <w:pPr>
+              <w:spacing w:before="0" w:after="0"/>
+            </w:pPr>
+            <w:r>
+              <w:rPr>
+                <w:sz w:val="9"/>
+              </w:rPr>
+              <w:t>DO_NOT_INVENT_ACTION_UID</w:t>
+            </w:r>
+          </w:p>
+        </w:tc>
+      </w:tr>
+    </w:tbl>
     <w:sectPr>
-      <w:pgSz w:w="16838" w:h="11906" w:orient="landscape"/>
-      <w:pgMar w:top="576" w:right="504" w:bottom="576" w:left="504" w:header="283" w:footer="283" w:gutter="0"/>
+      <w:pgSz w:w="11906" w:h="16838" w:orient="landscape"/>
+      <w:pgMar w:top="490" w:right="432" w:bottom="490" w:left="432" w:header="283" w:footer="283" w:gutter="0"/>
       <w:cols w:space="720"/>
       <w:docGrid w:linePitch="360"/>
     </w:sectPr>

</xml_diff>

<commit_message>
docs(acpos): close system03 persistence contract gaps
</commit_message>
<xml_diff>
--- a/ACPOS_AIAPI-01_AI_API管理_Mother_Basic_Design_OPTIMIZED.docx
+++ b/ACPOS_AIAPI-01_AI_API管理_Mother_Basic_Design_OPTIMIZED.docx
@@ -22679,10 +22679,7 @@
           </w:tcPr>
           <w:p>
             <w:r>
-              <w:rPr>
-                <w:sz w:val="10"/>
-              </w:rPr>
-              <w:t>—</w:t>
+              <w:t>Resolved Governed Resource Canonical Owner / Governance Audit</w:t>
             </w:r>
           </w:p>
         </w:tc>
@@ -22847,10 +22844,7 @@
           </w:tcPr>
           <w:p>
             <w:r>
-              <w:rPr>
-                <w:sz w:val="10"/>
-              </w:rPr>
-              <w:t>—</w:t>
+              <w:t>Resolved Governed Resource Canonical Owner / Approval Audit</w:t>
             </w:r>
           </w:p>
         </w:tc>
@@ -23189,10 +23183,7 @@
           </w:tcPr>
           <w:p>
             <w:r>
-              <w:rPr>
-                <w:sz w:val="10"/>
-              </w:rPr>
-              <w:t>—</w:t>
+              <w:t>ACPOS-AI-03 Sandbox Evidence / Audit Lineage</w:t>
             </w:r>
           </w:p>
         </w:tc>
@@ -24215,10 +24206,7 @@
           </w:tcPr>
           <w:p>
             <w:r>
-              <w:rPr>
-                <w:sz w:val="10"/>
-              </w:rPr>
-              <w:t>—</w:t>
+              <w:t>ACPOS-AI-03 Operational Control State / Audit Lineage</w:t>
             </w:r>
           </w:p>
         </w:tc>
@@ -25708,9 +25696,388 @@
         </w:tc>
       </w:tr>
     </w:tbl>
+    <w:p>
+      <w:pPr>
+        <w:sectPr>
+          <w:pgSz w:w="11906" w:h="16838" w:orient="landscape"/>
+          <w:pgMar w:top="490" w:right="432" w:bottom="490" w:left="432" w:header="283" w:footer="283" w:gutter="0"/>
+          <w:cols w:space="720"/>
+          <w:docGrid w:linePitch="360"/>
+        </w:sectPr>
+      </w:pPr>
+    </w:p>
+    <w:p>
+      <w:pPr>
+        <w:pStyle w:val="Heading1"/>
+      </w:pPr>
+      <w:r>
+        <w:t>Batch 38 · AIAPI Persistence Binding Ledger</w:t>
+      </w:r>
+    </w:p>
+    <w:p>
+      <w:r>
+        <w:rPr>
+          <w:b/>
+        </w:rPr>
+        <w:t xml:space="preserve">[ACPOS-20260922-BATCH-38-SYSTEM03-PERSISTENCE-REMEDIATION-V1::PAGE::AIAPI-01] </w:t>
+      </w:r>
+      <w:r>
+        <w:t>These four Persistence Owner bindings preserve existing Method/Path, Payload/Schema, Runtime Owner and Runtime Status. Governed-resource persistence remains with the exact resolved resource owner; sandbox and kill-switch evidence remain AI-03 operational/audit concerns. No Production execution claim is made.</w:t>
+      </w:r>
+    </w:p>
+    <w:tbl>
+      <w:tblPr>
+        <w:tblStyle w:val="TableGrid"/>
+        <w:tblW w:type="auto" w:w="0"/>
+        <w:tblLook w:firstColumn="1" w:firstRow="1" w:lastColumn="0" w:lastRow="0" w:noHBand="0" w:noVBand="1" w:val="04A0"/>
+      </w:tblPr>
+      <w:tblGrid>
+        <w:gridCol w:w="4008"/>
+        <w:gridCol w:w="4008"/>
+        <w:gridCol w:w="4008"/>
+        <w:gridCol w:w="4008"/>
+      </w:tblGrid>
+      <w:tr>
+        <w:trPr>
+          <w:tblHeader w:val="true"/>
+        </w:trPr>
+        <w:tc>
+          <w:tcPr>
+            <w:tcW w:type="dxa" w:w="4008"/>
+            <w:shd w:fill="EDE9FE"/>
+          </w:tcPr>
+          <w:p>
+            <w:pPr>
+              <w:spacing w:before="0" w:after="0"/>
+            </w:pPr>
+            <w:r>
+              <w:rPr>
+                <w:sz w:val="7"/>
+              </w:rPr>
+              <w:t>Control UID</w:t>
+            </w:r>
+          </w:p>
+        </w:tc>
+        <w:tc>
+          <w:tcPr>
+            <w:tcW w:type="dxa" w:w="4008"/>
+            <w:shd w:fill="EDE9FE"/>
+          </w:tcPr>
+          <w:p>
+            <w:pPr>
+              <w:spacing w:before="0" w:after="0"/>
+            </w:pPr>
+            <w:r>
+              <w:rPr>
+                <w:sz w:val="7"/>
+              </w:rPr>
+              <w:t>Operation</w:t>
+            </w:r>
+          </w:p>
+        </w:tc>
+        <w:tc>
+          <w:tcPr>
+            <w:tcW w:type="dxa" w:w="4008"/>
+            <w:shd w:fill="EDE9FE"/>
+          </w:tcPr>
+          <w:p>
+            <w:pPr>
+              <w:spacing w:before="0" w:after="0"/>
+            </w:pPr>
+            <w:r>
+              <w:rPr>
+                <w:sz w:val="7"/>
+              </w:rPr>
+              <w:t>Persistence Owner</w:t>
+            </w:r>
+          </w:p>
+        </w:tc>
+        <w:tc>
+          <w:tcPr>
+            <w:tcW w:type="dxa" w:w="4008"/>
+            <w:shd w:fill="EDE9FE"/>
+          </w:tcPr>
+          <w:p>
+            <w:pPr>
+              <w:spacing w:before="0" w:after="0"/>
+            </w:pPr>
+            <w:r>
+              <w:rPr>
+                <w:sz w:val="7"/>
+              </w:rPr>
+              <w:t>Required Semantics</w:t>
+            </w:r>
+          </w:p>
+        </w:tc>
+      </w:tr>
+      <w:tr>
+        <w:tc>
+          <w:tcPr>
+            <w:tcW w:type="dxa" w:w="4008"/>
+          </w:tcPr>
+          <w:p>
+            <w:pPr>
+              <w:spacing w:before="0" w:after="0"/>
+            </w:pPr>
+            <w:r>
+              <w:rPr>
+                <w:sz w:val="7"/>
+              </w:rPr>
+              <w:t>AIAPI-01-BTN-CONFIGURE-GOVERNED-RESOURCE</w:t>
+            </w:r>
+          </w:p>
+        </w:tc>
+        <w:tc>
+          <w:tcPr>
+            <w:tcW w:type="dxa" w:w="4008"/>
+          </w:tcPr>
+          <w:p>
+            <w:pPr>
+              <w:spacing w:before="0" w:after="0"/>
+            </w:pPr>
+            <w:r>
+              <w:rPr>
+                <w:sz w:val="7"/>
+              </w:rPr>
+              <w:t>configureGovernedResource</w:t>
+            </w:r>
+          </w:p>
+        </w:tc>
+        <w:tc>
+          <w:tcPr>
+            <w:tcW w:type="dxa" w:w="4008"/>
+          </w:tcPr>
+          <w:p>
+            <w:pPr>
+              <w:spacing w:before="0" w:after="0"/>
+            </w:pPr>
+            <w:r>
+              <w:rPr>
+                <w:sz w:val="7"/>
+              </w:rPr>
+              <w:t>Resolved Governed Resource Canonical Owner / Governance Audit</w:t>
+            </w:r>
+          </w:p>
+        </w:tc>
+        <w:tc>
+          <w:tcPr>
+            <w:tcW w:type="dxa" w:w="4008"/>
+          </w:tcPr>
+          <w:p>
+            <w:pPr>
+              <w:spacing w:before="0" w:after="0"/>
+            </w:pPr>
+            <w:r>
+              <w:rPr>
+                <w:sz w:val="7"/>
+              </w:rPr>
+              <w:t>The command configures an exact governed resource. AIAPI/IAM runtime must not steal domain persistence ownership; the exact resource owner persists state while governance audit preserves actor/correlation/version evidence.</w:t>
+            </w:r>
+          </w:p>
+        </w:tc>
+      </w:tr>
+      <w:tr>
+        <w:tc>
+          <w:tcPr>
+            <w:tcW w:type="dxa" w:w="4008"/>
+          </w:tcPr>
+          <w:p>
+            <w:pPr>
+              <w:spacing w:before="0" w:after="0"/>
+            </w:pPr>
+            <w:r>
+              <w:rPr>
+                <w:sz w:val="7"/>
+              </w:rPr>
+              <w:t>AIAPI-01-BTN-APPROVE-GOVERNED-RESOURCE</w:t>
+            </w:r>
+          </w:p>
+        </w:tc>
+        <w:tc>
+          <w:tcPr>
+            <w:tcW w:type="dxa" w:w="4008"/>
+          </w:tcPr>
+          <w:p>
+            <w:pPr>
+              <w:spacing w:before="0" w:after="0"/>
+            </w:pPr>
+            <w:r>
+              <w:rPr>
+                <w:sz w:val="7"/>
+              </w:rPr>
+              <w:t>approveGovernedResource</w:t>
+            </w:r>
+          </w:p>
+        </w:tc>
+        <w:tc>
+          <w:tcPr>
+            <w:tcW w:type="dxa" w:w="4008"/>
+          </w:tcPr>
+          <w:p>
+            <w:pPr>
+              <w:spacing w:before="0" w:after="0"/>
+            </w:pPr>
+            <w:r>
+              <w:rPr>
+                <w:sz w:val="7"/>
+              </w:rPr>
+              <w:t>Resolved Governed Resource Canonical Owner / Approval Audit</w:t>
+            </w:r>
+          </w:p>
+        </w:tc>
+        <w:tc>
+          <w:tcPr>
+            <w:tcW w:type="dxa" w:w="4008"/>
+          </w:tcPr>
+          <w:p>
+            <w:pPr>
+              <w:spacing w:before="0" w:after="0"/>
+            </w:pPr>
+            <w:r>
+              <w:rPr>
+                <w:sz w:val="7"/>
+              </w:rPr>
+              <w:t>Approval writes the governed resource's approved/version state under its canonical owner and preserves separate approver/rationale/audit evidence.</w:t>
+            </w:r>
+          </w:p>
+        </w:tc>
+      </w:tr>
+      <w:tr>
+        <w:tc>
+          <w:tcPr>
+            <w:tcW w:type="dxa" w:w="4008"/>
+          </w:tcPr>
+          <w:p>
+            <w:pPr>
+              <w:spacing w:before="0" w:after="0"/>
+            </w:pPr>
+            <w:r>
+              <w:rPr>
+                <w:sz w:val="7"/>
+              </w:rPr>
+              <w:t>AIAPI-01-BTN-RUN-SANDBOX-TEST</w:t>
+            </w:r>
+          </w:p>
+        </w:tc>
+        <w:tc>
+          <w:tcPr>
+            <w:tcW w:type="dxa" w:w="4008"/>
+          </w:tcPr>
+          <w:p>
+            <w:pPr>
+              <w:spacing w:before="0" w:after="0"/>
+            </w:pPr>
+            <w:r>
+              <w:rPr>
+                <w:sz w:val="7"/>
+              </w:rPr>
+              <w:t>runSandboxTest</w:t>
+            </w:r>
+          </w:p>
+        </w:tc>
+        <w:tc>
+          <w:tcPr>
+            <w:tcW w:type="dxa" w:w="4008"/>
+          </w:tcPr>
+          <w:p>
+            <w:pPr>
+              <w:spacing w:before="0" w:after="0"/>
+            </w:pPr>
+            <w:r>
+              <w:rPr>
+                <w:sz w:val="7"/>
+              </w:rPr>
+              <w:t>ACPOS-AI-03 Sandbox Evidence / Audit Lineage</w:t>
+            </w:r>
+          </w:p>
+        </w:tc>
+        <w:tc>
+          <w:tcPr>
+            <w:tcW w:type="dxa" w:w="4008"/>
+          </w:tcPr>
+          <w:p>
+            <w:pPr>
+              <w:spacing w:before="0" w:after="0"/>
+            </w:pPr>
+            <w:r>
+              <w:rPr>
+                <w:sz w:val="7"/>
+              </w:rPr>
+              <w:t>Sandbox may persist isolated test evidence and lineage only; Production secret/output writes and Production-pass claims remain forbidden.</w:t>
+            </w:r>
+          </w:p>
+        </w:tc>
+      </w:tr>
+      <w:tr>
+        <w:tc>
+          <w:tcPr>
+            <w:tcW w:type="dxa" w:w="4008"/>
+          </w:tcPr>
+          <w:p>
+            <w:pPr>
+              <w:spacing w:before="0" w:after="0"/>
+            </w:pPr>
+            <w:r>
+              <w:rPr>
+                <w:sz w:val="7"/>
+              </w:rPr>
+              <w:t>CTRL-ADMIN-AIAPI-09-ACT-02-ACT-KILL-SWITCH</w:t>
+            </w:r>
+          </w:p>
+        </w:tc>
+        <w:tc>
+          <w:tcPr>
+            <w:tcW w:type="dxa" w:w="4008"/>
+          </w:tcPr>
+          <w:p>
+            <w:pPr>
+              <w:spacing w:before="0" w:after="0"/>
+            </w:pPr>
+            <w:r>
+              <w:rPr>
+                <w:sz w:val="7"/>
+              </w:rPr>
+              <w:t>setKillSwitch</w:t>
+            </w:r>
+          </w:p>
+        </w:tc>
+        <w:tc>
+          <w:tcPr>
+            <w:tcW w:type="dxa" w:w="4008"/>
+          </w:tcPr>
+          <w:p>
+            <w:pPr>
+              <w:spacing w:before="0" w:after="0"/>
+            </w:pPr>
+            <w:r>
+              <w:rPr>
+                <w:sz w:val="7"/>
+              </w:rPr>
+              <w:t>ACPOS-AI-03 Operational Control State / Audit Lineage</w:t>
+            </w:r>
+          </w:p>
+        </w:tc>
+        <w:tc>
+          <w:tcPr>
+            <w:tcW w:type="dxa" w:w="4008"/>
+          </w:tcPr>
+          <w:p>
+            <w:pPr>
+              <w:spacing w:before="0" w:after="0"/>
+            </w:pPr>
+            <w:r>
+              <w:rPr>
+                <w:sz w:val="7"/>
+              </w:rPr>
+              <w:t>Kill switch is a server-side operational gate that dominates execution; state transition and authorized reason/correlation/audit evidence must remain reconstructable.</w:t>
+            </w:r>
+          </w:p>
+        </w:tc>
+      </w:tr>
+    </w:tbl>
     <w:sectPr>
-      <w:pgSz w:w="11906" w:h="16838" w:orient="landscape"/>
-      <w:pgMar w:top="490" w:right="432" w:bottom="490" w:left="432" w:header="283" w:footer="283" w:gutter="0"/>
+      <w:pgSz w:w="16838" w:h="11906" w:orient="landscape"/>
+      <w:pgMar w:top="475" w:right="403" w:bottom="475" w:left="403" w:header="283" w:footer="283" w:gutter="0"/>
       <w:cols w:space="720"/>
       <w:docGrid w:linePitch="360"/>
     </w:sectPr>

</xml_diff>